<commit_message>
data(HR-02): tighten the two advanced resumes against their frozen transcripts
The consistency rule is the plan 2.1 controller addition: neither advanced resume may contradict a claim its candidate makes in the frozen transcripts, each summed experience clears the largest single-technology claim recorded there, and no technology is named in more than one experience entry, so no resume offers a span for any quantified claim. Both resumes were re-swept against the six transcripts.

Co-Authored-By: Claude Fable 5 <noreply@anthropic.com>
Claude-Session: 16d6e9b4-8289-4423-b257-2c36b38e8366
</commit_message>
<xml_diff>
--- a/artifacts/HR-02/build/resume-ca-001.docx
+++ b/artifacts/HR-02/build/resume-ca-001.docx
@@ -104,7 +104,7 @@
         </w:numPr>
       </w:pPr>
       <w:r>
-        <w:t xml:space="preserve">Own the ingest and enrichment path that two product surfaces and a reporting group all read from, including the on call rotation for it.</w:t>
+        <w:t xml:space="preserve">Own the ingest and enrichment path five downstream teams read from, two of them outside engineering, including the on call rotation for it.</w:t>
       </w:r>
     </w:p>
     <w:p>
@@ -128,7 +128,7 @@
         </w:numPr>
       </w:pPr>
       <w:r>
-        <w:t xml:space="preserve">Keep every change note in one place, each carrying the before, the after, a date and what breaks for a consumer who does nothing.</w:t>
+        <w:t xml:space="preserve">Keep every change note in one place, each carrying the before, the after, a date and what breaks for a consumer who does nothing, and check live traffic before removing a field rather than trusting the window.</w:t>
       </w:r>
     </w:p>
     <w:p>
@@ -140,6 +140,18 @@
         </w:numPr>
       </w:pPr>
       <w:r>
+        <w:t xml:space="preserve">Rewrote the change note template sitting beside an analyst from a consuming operations group, who had told me the first versions were unreadable to them.</w:t>
+      </w:r>
+    </w:p>
+    <w:p>
+      <w:pPr>
+        <w:pStyle w:val="Compact"/>
+        <w:numPr>
+          <w:ilvl w:val="0"/>
+          <w:numId w:val="1002"/>
+        </w:numPr>
+      </w:pPr>
+      <w:r>
         <w:t xml:space="preserve">Mentor two engineers and run the on call handover.</w:t>
       </w:r>
     </w:p>
@@ -162,7 +174,7 @@
         </w:numPr>
       </w:pPr>
       <w:r>
-        <w:t xml:space="preserve">Built the enrichment service that later became the path I own, and rewrote it once when the first shape could not carry a second producer.</w:t>
+        <w:t xml:space="preserve">Built the services behind a reporting product and the batch jobs that fed them.</w:t>
       </w:r>
     </w:p>
     <w:p>
@@ -174,19 +186,7 @@
         </w:numPr>
       </w:pPr>
       <w:r>
-        <w:t xml:space="preserve">Learned to check live traffic before removing a field, after a deprecation with a long announcement window broke a consumer over a weekend.</w:t>
-      </w:r>
-    </w:p>
-    <w:p>
-      <w:pPr>
-        <w:pStyle w:val="Compact"/>
-        <w:numPr>
-          <w:ilvl w:val="0"/>
-          <w:numId w:val="1003"/>
-        </w:numPr>
-      </w:pPr>
-      <w:r>
-        <w:t xml:space="preserve">Rewrote the change note template sitting beside an analyst from a consuming operations group, who had told me the first versions were unreadable to them.</w:t>
+        <w:t xml:space="preserve">Ran the container platform the team deployed onto, which is where the habit of being paged for somebody else’s default came from.</w:t>
       </w:r>
     </w:p>
     <w:bookmarkEnd w:id="11"/>

</xml_diff>